<commit_message>
Move HR form footers into Word footers; center filled cells
Footers were body tables pushed down by fixed spacers, so they floated or spilled to page 2 as content height changed. They now live in footer1.xml on every section. Filled value cells are centered horizontally and vertically; rows holding signatures or names grow instead of cropping.
</commit_message>
<xml_diff>
--- a/backend/templates/GSSG-HR 300-014_HR Request Form.docx
+++ b/backend/templates/GSSG-HR 300-014_HR Request Form.docx
@@ -566,8 +566,13 @@
               <w:start w:w="0" w:type="dxa"/>
               <w:end w:w="0" w:type="dxa"/>
             </w:tcMar>
+            <w:vAlign w:val="center"/>
           </w:tcPr>
           <w:p>
+            <w:pPr>
+              <w:spacing w:before="0" w:after="0" w:line="240" w:lineRule="auto"/>
+              <w:jc w:val="center"/>
+            </w:pPr>
             <w:r>
               <w:t xml:space="preserve">{{ request_date }}</w:t>
             </w:r>
@@ -644,8 +649,13 @@
               <w:start w:w="0" w:type="dxa"/>
               <w:end w:w="0" w:type="dxa"/>
             </w:tcMar>
+            <w:vAlign w:val="center"/>
           </w:tcPr>
           <w:p>
+            <w:pPr>
+              <w:spacing w:before="0" w:after="0" w:line="240" w:lineRule="auto"/>
+              <w:jc w:val="center"/>
+            </w:pPr>
             <w:r>
               <w:t xml:space="preserve">{{ employee_id }}</w:t>
             </w:r>
@@ -654,7 +664,7 @@
       </w:tr>
       <w:tr>
         <w:trPr>
-          <w:trHeight w:hRule="exact" w:val="532"/>
+          <w:trHeight w:hRule="atLeast" w:val="532"/>
         </w:trPr>
         <w:tc>
           <w:tcPr>
@@ -739,8 +749,13 @@
               <w:start w:w="0" w:type="dxa"/>
               <w:end w:w="0" w:type="dxa"/>
             </w:tcMar>
+            <w:vAlign w:val="center"/>
           </w:tcPr>
           <w:p>
+            <w:pPr>
+              <w:spacing w:before="0" w:after="0" w:line="240" w:lineRule="auto"/>
+              <w:jc w:val="center"/>
+            </w:pPr>
             <w:r>
               <w:t xml:space="preserve">{{ name }}</w:t>
             </w:r>
@@ -805,8 +820,13 @@
               <w:start w:w="0" w:type="dxa"/>
               <w:end w:w="0" w:type="dxa"/>
             </w:tcMar>
+            <w:vAlign w:val="center"/>
           </w:tcPr>
           <w:p>
+            <w:pPr>
+              <w:spacing w:before="0" w:after="0" w:line="240" w:lineRule="auto"/>
+              <w:jc w:val="center"/>
+            </w:pPr>
             <w:r>
               <w:t xml:space="preserve">{{ position }}</w:t>
             </w:r>
@@ -883,8 +903,13 @@
               <w:start w:w="0" w:type="dxa"/>
               <w:end w:w="0" w:type="dxa"/>
             </w:tcMar>
+            <w:vAlign w:val="center"/>
           </w:tcPr>
           <w:p>
+            <w:pPr>
+              <w:spacing w:before="0" w:after="0" w:line="240" w:lineRule="auto"/>
+              <w:jc w:val="center"/>
+            </w:pPr>
             <w:r>
               <w:t xml:space="preserve">{{ location }}</w:t>
             </w:r>
@@ -949,8 +974,13 @@
               <w:start w:w="0" w:type="dxa"/>
               <w:end w:w="0" w:type="dxa"/>
             </w:tcMar>
+            <w:vAlign w:val="center"/>
           </w:tcPr>
           <w:p>
+            <w:pPr>
+              <w:spacing w:before="0" w:after="0" w:line="240" w:lineRule="auto"/>
+              <w:jc w:val="center"/>
+            </w:pPr>
             <w:r>
               <w:t xml:space="preserve">{{ join_date }}</w:t>
             </w:r>
@@ -1027,8 +1057,13 @@
               <w:start w:w="0" w:type="dxa"/>
               <w:end w:w="0" w:type="dxa"/>
             </w:tcMar>
+            <w:vAlign w:val="center"/>
           </w:tcPr>
           <w:p>
+            <w:pPr>
+              <w:spacing w:before="0" w:after="0" w:line="240" w:lineRule="auto"/>
+              <w:jc w:val="center"/>
+            </w:pPr>
             <w:r>
               <w:t xml:space="preserve">{{ phone }}</w:t>
             </w:r>
@@ -1182,15 +1217,15 @@
               <w:start w:w="0" w:type="dxa"/>
               <w:end w:w="0" w:type="dxa"/>
             </w:tcMar>
+            <w:vAlign w:val="center"/>
           </w:tcPr>
           <w:p>
             <w:pPr>
               <w:autoSpaceDN w:val="0"/>
               <w:autoSpaceDE w:val="0"/>
               <w:widowControl/>
-              <w:spacing w:line="238" w:lineRule="auto" w:before="158" w:after="0"/>
-              <w:ind w:left="104" w:right="0" w:firstLine="0"/>
-              <w:jc w:val="left"/>
+              <w:spacing w:before="0" w:after="0" w:line="240" w:lineRule="auto"/>
+              <w:jc w:val="center"/>
             </w:pPr>
             <w:r>
               <w:rPr>
@@ -1261,15 +1296,15 @@
               <w:start w:w="0" w:type="dxa"/>
               <w:end w:w="0" w:type="dxa"/>
             </w:tcMar>
+            <w:vAlign w:val="center"/>
           </w:tcPr>
           <w:p>
             <w:pPr>
               <w:autoSpaceDN w:val="0"/>
               <w:autoSpaceDE w:val="0"/>
               <w:widowControl/>
-              <w:spacing w:line="238" w:lineRule="auto" w:before="158" w:after="0"/>
-              <w:ind w:left="102" w:right="0" w:firstLine="0"/>
-              <w:jc w:val="left"/>
+              <w:spacing w:before="0" w:after="0" w:line="240" w:lineRule="auto"/>
+              <w:jc w:val="center"/>
             </w:pPr>
             <w:r>
               <w:rPr>
@@ -1359,15 +1394,15 @@
               <w:start w:w="0" w:type="dxa"/>
               <w:end w:w="0" w:type="dxa"/>
             </w:tcMar>
+            <w:vAlign w:val="center"/>
           </w:tcPr>
           <w:p>
             <w:pPr>
               <w:autoSpaceDN w:val="0"/>
               <w:autoSpaceDE w:val="0"/>
               <w:widowControl/>
-              <w:spacing w:line="240" w:lineRule="auto" w:before="156" w:after="0"/>
-              <w:ind w:left="104" w:right="0" w:firstLine="0"/>
-              <w:jc w:val="left"/>
+              <w:spacing w:before="0" w:after="0" w:line="240" w:lineRule="auto"/>
+              <w:jc w:val="center"/>
             </w:pPr>
             <w:r>
               <w:rPr>
@@ -1438,15 +1473,15 @@
               <w:start w:w="0" w:type="dxa"/>
               <w:end w:w="0" w:type="dxa"/>
             </w:tcMar>
+            <w:vAlign w:val="center"/>
           </w:tcPr>
           <w:p>
             <w:pPr>
               <w:autoSpaceDN w:val="0"/>
               <w:autoSpaceDE w:val="0"/>
               <w:widowControl/>
-              <w:spacing w:line="240" w:lineRule="auto" w:before="156" w:after="0"/>
-              <w:ind w:left="102" w:right="0" w:firstLine="0"/>
-              <w:jc w:val="left"/>
+              <w:spacing w:before="0" w:after="0" w:line="240" w:lineRule="auto"/>
+              <w:jc w:val="center"/>
             </w:pPr>
             <w:r>
               <w:rPr>
@@ -1536,15 +1571,15 @@
               <w:start w:w="0" w:type="dxa"/>
               <w:end w:w="0" w:type="dxa"/>
             </w:tcMar>
+            <w:vAlign w:val="center"/>
           </w:tcPr>
           <w:p>
             <w:pPr>
               <w:autoSpaceDN w:val="0"/>
               <w:autoSpaceDE w:val="0"/>
               <w:widowControl/>
-              <w:spacing w:line="238" w:lineRule="auto" w:before="156" w:after="0"/>
-              <w:ind w:left="104" w:right="0" w:firstLine="0"/>
-              <w:jc w:val="left"/>
+              <w:spacing w:before="0" w:after="0" w:line="240" w:lineRule="auto"/>
+              <w:jc w:val="center"/>
             </w:pPr>
             <w:r>
               <w:rPr>
@@ -1615,15 +1650,15 @@
               <w:start w:w="0" w:type="dxa"/>
               <w:end w:w="0" w:type="dxa"/>
             </w:tcMar>
+            <w:vAlign w:val="center"/>
           </w:tcPr>
           <w:p>
             <w:pPr>
               <w:autoSpaceDN w:val="0"/>
               <w:autoSpaceDE w:val="0"/>
               <w:widowControl/>
-              <w:spacing w:line="238" w:lineRule="auto" w:before="156" w:after="0"/>
-              <w:ind w:left="102" w:right="0" w:firstLine="0"/>
-              <w:jc w:val="left"/>
+              <w:spacing w:before="0" w:after="0" w:line="240" w:lineRule="auto"/>
+              <w:jc w:val="center"/>
             </w:pPr>
             <w:r>
               <w:rPr>
@@ -1713,15 +1748,15 @@
               <w:start w:w="0" w:type="dxa"/>
               <w:end w:w="0" w:type="dxa"/>
             </w:tcMar>
+            <w:vAlign w:val="center"/>
           </w:tcPr>
           <w:p>
             <w:pPr>
               <w:autoSpaceDN w:val="0"/>
               <w:autoSpaceDE w:val="0"/>
               <w:widowControl/>
-              <w:spacing w:line="240" w:lineRule="auto" w:before="160" w:after="0"/>
-              <w:ind w:left="104" w:right="0" w:firstLine="0"/>
-              <w:jc w:val="left"/>
+              <w:spacing w:before="0" w:after="0" w:line="240" w:lineRule="auto"/>
+              <w:jc w:val="center"/>
             </w:pPr>
             <w:r>
               <w:rPr>
@@ -1852,8 +1887,13 @@
               <w:start w:w="0" w:type="dxa"/>
               <w:end w:w="0" w:type="dxa"/>
             </w:tcMar>
+            <w:vAlign w:val="center"/>
           </w:tcPr>
           <w:p>
+            <w:pPr>
+              <w:spacing w:before="0" w:after="0" w:line="240" w:lineRule="auto"/>
+              <w:jc w:val="center"/>
+            </w:pPr>
             <w:r>
               <w:t xml:space="preserve">{{ please_specify if any_other_checked else '' }}</w:t>
             </w:r>
@@ -1947,8 +1987,13 @@
               <w:start w:w="0" w:type="dxa"/>
               <w:end w:w="0" w:type="dxa"/>
             </w:tcMar>
+            <w:vAlign w:val="center"/>
           </w:tcPr>
           <w:p>
+            <w:pPr>
+              <w:spacing w:before="0" w:after="0" w:line="240" w:lineRule="auto"/>
+              <w:jc w:val="center"/>
+            </w:pPr>
             <w:r>
               <w:t xml:space="preserve">{{ addressed_to }}</w:t>
             </w:r>
@@ -2042,8 +2087,13 @@
               <w:start w:w="0" w:type="dxa"/>
               <w:end w:w="0" w:type="dxa"/>
             </w:tcMar>
+            <w:vAlign w:val="center"/>
           </w:tcPr>
           <w:p>
+            <w:pPr>
+              <w:spacing w:before="0" w:after="0" w:line="240" w:lineRule="auto"/>
+              <w:jc w:val="center"/>
+            </w:pPr>
             <w:r>
               <w:t xml:space="preserve">{{ purpose }}</w:t>
             </w:r>
@@ -2376,7 +2426,7 @@
       </w:tr>
       <w:tr>
         <w:trPr>
-          <w:trHeight w:hRule="exact" w:val="706"/>
+          <w:trHeight w:hRule="atLeast" w:val="706"/>
         </w:trPr>
         <w:tc>
           <w:tcPr>
@@ -2482,8 +2532,13 @@
               <w:start w:w="0" w:type="dxa"/>
               <w:end w:w="0" w:type="dxa"/>
             </w:tcMar>
+            <w:vAlign w:val="center"/>
           </w:tcPr>
           <w:p>
+            <w:pPr>
+              <w:spacing w:before="0" w:after="0" w:line="240" w:lineRule="auto"/>
+              <w:jc w:val="center"/>
+            </w:pPr>
             <w:r>
               <w:t xml:space="preserve">{{ name }}</w:t>
             </w:r>
@@ -2602,8 +2657,13 @@
               <w:start w:w="0" w:type="dxa"/>
               <w:end w:w="0" w:type="dxa"/>
             </w:tcMar>
+            <w:vAlign w:val="center"/>
           </w:tcPr>
           <w:p>
+            <w:pPr>
+              <w:spacing w:before="0" w:after="0" w:line="240" w:lineRule="auto"/>
+              <w:jc w:val="center"/>
+            </w:pPr>
             <w:r>
               <w:t xml:space="preserve">{{ request_date if employee_sig_path else '' }} {{ employee_sig }}</w:t>
             </w:r>
@@ -2612,7 +2672,7 @@
       </w:tr>
       <w:tr>
         <w:trPr>
-          <w:trHeight w:hRule="exact" w:val="708"/>
+          <w:trHeight w:hRule="atLeast" w:val="708"/>
         </w:trPr>
         <w:tc>
           <w:tcPr>
@@ -2718,8 +2778,13 @@
               <w:start w:w="0" w:type="dxa"/>
               <w:end w:w="0" w:type="dxa"/>
             </w:tcMar>
+            <w:vAlign w:val="center"/>
           </w:tcPr>
           <w:p>
+            <w:pPr>
+              <w:spacing w:before="0" w:after="0" w:line="240" w:lineRule="auto"/>
+              <w:jc w:val="center"/>
+            </w:pPr>
             <w:r>
               <w:t xml:space="preserve">{{ manager_name }}</w:t>
             </w:r>
@@ -2838,8 +2903,13 @@
               <w:start w:w="0" w:type="dxa"/>
               <w:end w:w="0" w:type="dxa"/>
             </w:tcMar>
+            <w:vAlign w:val="center"/>
           </w:tcPr>
           <w:p>
+            <w:pPr>
+              <w:spacing w:before="0" w:after="0" w:line="240" w:lineRule="auto"/>
+              <w:jc w:val="center"/>
+            </w:pPr>
             <w:r>
               <w:t xml:space="preserve">{{ today if manager_sig_path else '' }} {{ manager_sig }}</w:t>
             </w:r>
@@ -3344,466 +3414,477 @@
         <w:autoSpaceDN w:val="0"/>
         <w:autoSpaceDE w:val="0"/>
         <w:widowControl/>
-        <w:spacing w:line="240" w:lineRule="auto" w:before="970" w:after="356"/>
-        <w:ind w:left="0" w:right="0" w:firstLine="0"/>
-        <w:jc w:val="left"/>
-      </w:pPr>
-      <w:r>
-        <w:drawing>
-          <wp:inline xmlns:a="http://schemas.openxmlformats.org/drawingml/2006/main" xmlns:pic="http://schemas.openxmlformats.org/drawingml/2006/picture">
-            <wp:extent cx="6616700" cy="203200"/>
-            <wp:docPr id="3" name="Picture 3"/>
-            <wp:cNvGraphicFramePr>
-              <a:graphicFrameLocks noChangeAspect="1"/>
-            </wp:cNvGraphicFramePr>
-            <a:graphic>
-              <a:graphicData uri="http://schemas.openxmlformats.org/drawingml/2006/picture">
-                <pic:pic>
-                  <pic:nvPicPr>
-                    <pic:cNvPr id="0" name="image.png"/>
-                    <pic:cNvPicPr/>
-                  </pic:nvPicPr>
-                  <pic:blipFill>
-                    <a:blip r:embed="rId11"/>
-                    <a:stretch>
-                      <a:fillRect/>
-                    </a:stretch>
-                  </pic:blipFill>
-                  <pic:spPr>
-                    <a:xfrm>
-                      <a:off x="0" y="0"/>
-                      <a:ext cx="6616700" cy="203200"/>
-                    </a:xfrm>
-                    <a:prstGeom prst="rect"/>
-                  </pic:spPr>
-                </pic:pic>
-              </a:graphicData>
-            </a:graphic>
-          </wp:inline>
-        </w:drawing>
-      </w:r>
-    </w:p>
-    <w:tbl>
-      <w:tblPr>
-        <w:tblW w:type="auto" w:w="0"/>
-        <w:tblLayout w:type="fixed"/>
-        <w:tblLook w:firstColumn="1" w:firstRow="1" w:lastColumn="0" w:lastRow="0" w:noHBand="0" w:noVBand="1" w:val="04A0"/>
-        <w:tblInd w:w="620.0" w:type="dxa"/>
-      </w:tblPr>
-      <w:tblGrid>
-        <w:gridCol w:w="1504"/>
-        <w:gridCol w:w="1504"/>
-        <w:gridCol w:w="1504"/>
-        <w:gridCol w:w="1504"/>
-        <w:gridCol w:w="1504"/>
-        <w:gridCol w:w="1504"/>
-      </w:tblGrid>
-      <w:tr>
-        <w:trPr>
-          <w:trHeight w:hRule="exact" w:val="292"/>
-        </w:trPr>
-        <w:tc>
-          <w:tcPr>
-            <w:tcW w:type="dxa" w:w="1080"/>
-            <w:vMerge w:val="restart"/>
-            <w:tcBorders/>
-            <w:tcMar>
-              <w:start w:w="0" w:type="dxa"/>
-              <w:end w:w="0" w:type="dxa"/>
-            </w:tcMar>
-            <w:tcMar>
-              <w:start w:w="0" w:type="dxa"/>
-              <w:end w:w="0" w:type="dxa"/>
-            </w:tcMar>
-          </w:tcPr>
-          <w:p>
-            <w:pPr>
-              <w:autoSpaceDN w:val="0"/>
-              <w:autoSpaceDE w:val="0"/>
-              <w:widowControl/>
-              <w:spacing w:line="240" w:lineRule="auto" w:before="110" w:after="0"/>
-              <w:ind w:left="0" w:right="40" w:firstLine="0"/>
-              <w:jc w:val="right"/>
-            </w:pPr>
-            <w:r>
-              <w:drawing>
-                <wp:inline xmlns:a="http://schemas.openxmlformats.org/drawingml/2006/main" xmlns:pic="http://schemas.openxmlformats.org/drawingml/2006/picture">
-                  <wp:extent cx="251459" cy="252730"/>
-                  <wp:docPr id="4" name="Picture 4"/>
-                  <wp:cNvGraphicFramePr>
-                    <a:graphicFrameLocks noChangeAspect="1"/>
-                  </wp:cNvGraphicFramePr>
-                  <a:graphic>
-                    <a:graphicData uri="http://schemas.openxmlformats.org/drawingml/2006/picture">
-                      <pic:pic>
-                        <pic:nvPicPr>
-                          <pic:cNvPr id="0" name="image.png"/>
-                          <pic:cNvPicPr/>
-                        </pic:nvPicPr>
-                        <pic:blipFill>
-                          <a:blip r:embed="rId12"/>
-                          <a:stretch>
-                            <a:fillRect/>
-                          </a:stretch>
-                        </pic:blipFill>
-                        <pic:spPr>
-                          <a:xfrm>
-                            <a:off x="0" y="0"/>
-                            <a:ext cx="251459" cy="252730"/>
-                          </a:xfrm>
-                          <a:prstGeom prst="rect"/>
-                        </pic:spPr>
-                      </pic:pic>
-                    </a:graphicData>
-                  </a:graphic>
-                </wp:inline>
-              </w:drawing>
-            </w:r>
-          </w:p>
-        </w:tc>
-        <w:tc>
-          <w:tcPr>
-            <w:tcW w:type="dxa" w:w="2460"/>
-            <w:vMerge w:val="restart"/>
-            <w:tcBorders/>
-            <w:tcMar>
-              <w:start w:w="0" w:type="dxa"/>
-              <w:end w:w="0" w:type="dxa"/>
-            </w:tcMar>
-            <w:tcMar>
-              <w:start w:w="0" w:type="dxa"/>
-              <w:end w:w="0" w:type="dxa"/>
-            </w:tcMar>
-          </w:tcPr>
-          <w:p>
-            <w:pPr>
-              <w:autoSpaceDN w:val="0"/>
-              <w:autoSpaceDE w:val="0"/>
-              <w:widowControl/>
-              <w:spacing w:line="197" w:lineRule="auto" w:before="248" w:after="0"/>
-              <w:ind w:left="48" w:right="0" w:firstLine="0"/>
-              <w:jc w:val="left"/>
-            </w:pPr>
-            <w:r>
-              <w:rPr>
-                <w:rFonts w:ascii="Calibri" w:hAnsi="Calibri" w:eastAsia="Calibri"/>
-                <w:b w:val="0"/>
-                <w:i w:val="0"/>
-                <w:color w:val="A09F9F"/>
-                <w:sz w:val="16"/>
-              </w:rPr>
-              <w:t>Abu Dhabi, United Arab Emirates</w:t>
-            </w:r>
-          </w:p>
-        </w:tc>
-        <w:tc>
-          <w:tcPr>
-            <w:tcW w:type="dxa" w:w="980"/>
-            <w:vMerge w:val="restart"/>
-            <w:tcBorders/>
-            <w:tcMar>
-              <w:start w:w="0" w:type="dxa"/>
-              <w:end w:w="0" w:type="dxa"/>
-            </w:tcMar>
-            <w:tcMar>
-              <w:start w:w="0" w:type="dxa"/>
-              <w:end w:w="0" w:type="dxa"/>
-            </w:tcMar>
-          </w:tcPr>
-          <w:p>
-            <w:pPr>
-              <w:autoSpaceDN w:val="0"/>
-              <w:autoSpaceDE w:val="0"/>
-              <w:widowControl/>
-              <w:spacing w:line="240" w:lineRule="auto" w:before="78" w:after="0"/>
-              <w:ind w:left="0" w:right="112" w:firstLine="0"/>
-              <w:jc w:val="right"/>
-            </w:pPr>
-            <w:r>
-              <w:drawing>
-                <wp:inline xmlns:a="http://schemas.openxmlformats.org/drawingml/2006/main" xmlns:pic="http://schemas.openxmlformats.org/drawingml/2006/picture">
-                  <wp:extent cx="251460" cy="252729"/>
-                  <wp:docPr id="5" name="Picture 5"/>
-                  <wp:cNvGraphicFramePr>
-                    <a:graphicFrameLocks noChangeAspect="1"/>
-                  </wp:cNvGraphicFramePr>
-                  <a:graphic>
-                    <a:graphicData uri="http://schemas.openxmlformats.org/drawingml/2006/picture">
-                      <pic:pic>
-                        <pic:nvPicPr>
-                          <pic:cNvPr id="0" name="image.png"/>
-                          <pic:cNvPicPr/>
-                        </pic:nvPicPr>
-                        <pic:blipFill>
-                          <a:blip r:embed="rId13"/>
-                          <a:stretch>
-                            <a:fillRect/>
-                          </a:stretch>
-                        </pic:blipFill>
-                        <pic:spPr>
-                          <a:xfrm>
-                            <a:off x="0" y="0"/>
-                            <a:ext cx="251460" cy="252729"/>
-                          </a:xfrm>
-                          <a:prstGeom prst="rect"/>
-                        </pic:spPr>
-                      </pic:pic>
-                    </a:graphicData>
-                  </a:graphic>
-                </wp:inline>
-              </w:drawing>
-            </w:r>
-          </w:p>
-        </w:tc>
-        <w:tc>
-          <w:tcPr>
-            <w:tcW w:type="dxa" w:w="2200"/>
-            <w:tcBorders/>
-            <w:tcMar>
-              <w:start w:w="0" w:type="dxa"/>
-              <w:end w:w="0" w:type="dxa"/>
-            </w:tcMar>
-          </w:tcPr>
-          <w:p>
-            <w:pPr>
-              <w:autoSpaceDN w:val="0"/>
-              <w:autoSpaceDE w:val="0"/>
-              <w:widowControl/>
-              <w:spacing w:line="175" w:lineRule="auto" w:before="48" w:after="0"/>
-              <w:ind w:left="136" w:right="0" w:firstLine="0"/>
-              <w:jc w:val="left"/>
-            </w:pPr>
-            <w:r>
-              <w:rPr>
-                <w:rFonts w:ascii="Myanmar Text" w:hAnsi="Myanmar Text" w:eastAsia="Myanmar Text"/>
-                <w:b w:val="0"/>
-                <w:i w:val="0"/>
-                <w:color w:val="A09F9F"/>
-                <w:sz w:val="18"/>
-              </w:rPr>
-              <w:hyperlink r:id="rId14" w:history="1">
-                <w:r>
-                  <w:rPr>
-                    <w:rStyle w:val="Hyperlink"/>
-                  </w:rPr>
-                  <w:t>info@gss-group.net</w:t>
-                </w:r>
-              </w:hyperlink>
-            </w:r>
-          </w:p>
-        </w:tc>
-        <w:tc>
-          <w:tcPr>
-            <w:tcW w:type="dxa" w:w="1120"/>
-            <w:vMerge w:val="restart"/>
-            <w:tcBorders/>
-            <w:tcMar>
-              <w:start w:w="0" w:type="dxa"/>
-              <w:end w:w="0" w:type="dxa"/>
-            </w:tcMar>
-            <w:tcMar>
-              <w:start w:w="0" w:type="dxa"/>
-              <w:end w:w="0" w:type="dxa"/>
-            </w:tcMar>
-          </w:tcPr>
-          <w:p>
-            <w:pPr>
-              <w:autoSpaceDN w:val="0"/>
-              <w:autoSpaceDE w:val="0"/>
-              <w:widowControl/>
-              <w:spacing w:line="240" w:lineRule="auto" w:before="92" w:after="0"/>
-              <w:ind w:left="0" w:right="76" w:firstLine="0"/>
-              <w:jc w:val="right"/>
-            </w:pPr>
-            <w:r>
-              <w:drawing>
-                <wp:inline xmlns:a="http://schemas.openxmlformats.org/drawingml/2006/main" xmlns:pic="http://schemas.openxmlformats.org/drawingml/2006/picture">
-                  <wp:extent cx="251460" cy="252729"/>
-                  <wp:docPr id="6" name="Picture 6"/>
-                  <wp:cNvGraphicFramePr>
-                    <a:graphicFrameLocks noChangeAspect="1"/>
-                  </wp:cNvGraphicFramePr>
-                  <a:graphic>
-                    <a:graphicData uri="http://schemas.openxmlformats.org/drawingml/2006/picture">
-                      <pic:pic>
-                        <pic:nvPicPr>
-                          <pic:cNvPr id="0" name="image.png"/>
-                          <pic:cNvPicPr/>
-                        </pic:nvPicPr>
-                        <pic:blipFill>
-                          <a:blip r:embed="rId15"/>
-                          <a:stretch>
-                            <a:fillRect/>
-                          </a:stretch>
-                        </pic:blipFill>
-                        <pic:spPr>
-                          <a:xfrm>
-                            <a:off x="0" y="0"/>
-                            <a:ext cx="251460" cy="252729"/>
-                          </a:xfrm>
-                          <a:prstGeom prst="rect"/>
-                        </pic:spPr>
-                      </pic:pic>
-                    </a:graphicData>
-                  </a:graphic>
-                </wp:inline>
-              </w:drawing>
-            </w:r>
-          </w:p>
-        </w:tc>
-        <w:tc>
-          <w:tcPr>
-            <w:tcW w:type="dxa" w:w="2600"/>
-            <w:tcBorders/>
-            <w:tcMar>
-              <w:start w:w="0" w:type="dxa"/>
-              <w:end w:w="0" w:type="dxa"/>
-            </w:tcMar>
-          </w:tcPr>
-          <w:p>
-            <w:pPr>
-              <w:autoSpaceDN w:val="0"/>
-              <w:autoSpaceDE w:val="0"/>
-              <w:widowControl/>
-              <w:spacing w:line="175" w:lineRule="auto" w:before="46" w:after="0"/>
-              <w:ind w:left="112" w:right="0" w:firstLine="0"/>
-              <w:jc w:val="left"/>
-            </w:pPr>
-            <w:r>
-              <w:rPr>
-                <w:rFonts w:ascii="Myanmar Text" w:hAnsi="Myanmar Text" w:eastAsia="Myanmar Text"/>
-                <w:b w:val="0"/>
-                <w:i w:val="0"/>
-                <w:color w:val="A09F9F"/>
-                <w:sz w:val="18"/>
-              </w:rPr>
-              <w:t>Phone: +9712 6666898</w:t>
-            </w:r>
-          </w:p>
-        </w:tc>
-      </w:tr>
-      <w:tr>
-        <w:trPr>
-          <w:trHeight w:hRule="exact" w:val="220"/>
-        </w:trPr>
-        <w:tc>
-          <w:tcPr>
-            <w:tcW w:type="dxa" w:w="1504"/>
-            <w:vMerge/>
-            <w:tcBorders/>
-          </w:tcPr>
-          <w:p/>
-        </w:tc>
-        <w:tc>
-          <w:tcPr>
-            <w:tcW w:type="dxa" w:w="1504"/>
-            <w:vMerge/>
-            <w:tcBorders/>
-          </w:tcPr>
-          <w:p/>
-        </w:tc>
-        <w:tc>
-          <w:tcPr>
-            <w:tcW w:type="dxa" w:w="1504"/>
-            <w:vMerge/>
-            <w:tcBorders/>
-          </w:tcPr>
-          <w:p/>
-        </w:tc>
-        <w:tc>
-          <w:tcPr>
-            <w:tcW w:type="dxa" w:w="2200"/>
-            <w:tcBorders/>
-            <w:tcMar>
-              <w:start w:w="0" w:type="dxa"/>
-              <w:end w:w="0" w:type="dxa"/>
-            </w:tcMar>
-          </w:tcPr>
-          <w:p>
-            <w:pPr>
-              <w:autoSpaceDN w:val="0"/>
-              <w:autoSpaceDE w:val="0"/>
-              <w:widowControl/>
-              <w:spacing w:line="175" w:lineRule="auto" w:before="0" w:after="0"/>
-              <w:ind w:left="152" w:right="0" w:firstLine="0"/>
-              <w:jc w:val="left"/>
-            </w:pPr>
-            <w:r>
-              <w:rPr>
-                <w:rFonts w:ascii="Myanmar Text" w:hAnsi="Myanmar Text" w:eastAsia="Myanmar Text"/>
-                <w:b w:val="0"/>
-                <w:i w:val="0"/>
-                <w:color w:val="A09F9F"/>
-                <w:sz w:val="18"/>
-              </w:rPr>
-              <w:hyperlink r:id="rId14" w:history="1">
-                <w:r>
-                  <w:rPr>
-                    <w:rStyle w:val="Hyperlink"/>
-                  </w:rPr>
-                  <w:t>www.gss-group.net</w:t>
-                </w:r>
-              </w:hyperlink>
-            </w:r>
-          </w:p>
-        </w:tc>
-        <w:tc>
-          <w:tcPr>
-            <w:tcW w:type="dxa" w:w="1504"/>
-            <w:vMerge/>
-            <w:tcBorders/>
-          </w:tcPr>
-          <w:p/>
-        </w:tc>
-        <w:tc>
-          <w:tcPr>
-            <w:tcW w:type="dxa" w:w="2600"/>
-            <w:tcBorders/>
-            <w:tcMar>
-              <w:start w:w="0" w:type="dxa"/>
-              <w:end w:w="0" w:type="dxa"/>
-            </w:tcMar>
-          </w:tcPr>
-          <w:p>
-            <w:pPr>
-              <w:autoSpaceDN w:val="0"/>
-              <w:autoSpaceDE w:val="0"/>
-              <w:widowControl/>
-              <w:spacing w:line="240" w:lineRule="auto" w:before="0" w:after="0"/>
-              <w:ind w:left="112" w:right="0" w:firstLine="0"/>
-              <w:jc w:val="left"/>
-            </w:pPr>
-            <w:r>
-              <w:rPr>
-                <w:rFonts w:ascii="Gill Sans MT" w:hAnsi="Gill Sans MT" w:eastAsia="Gill Sans MT"/>
-                <w:b w:val="0"/>
-                <w:i w:val="0"/>
-                <w:color w:val="A09F9F"/>
-                <w:sz w:val="19"/>
-              </w:rPr>
-              <w:t>Fax: +971 2 666 8980</w:t>
-            </w:r>
-          </w:p>
-        </w:tc>
-      </w:tr>
-    </w:tbl>
-    <w:p>
-      <w:pPr>
-        <w:autoSpaceDN w:val="0"/>
-        <w:autoSpaceDE w:val="0"/>
-        <w:widowControl/>
         <w:spacing w:line="14" w:lineRule="exact" w:before="0" w:after="0"/>
         <w:ind w:left="0" w:right="0"/>
       </w:pPr>
     </w:p>
     <w:sectPr>
+      <w:footerReference w:type="default" r:id="rIdFtr1"/>
       <w:pgSz w:w="11906" w:h="16838"/>
-      <w:pgMar w:top="300" w:right="0" w:bottom="226" w:left="0" w:header="720" w:footer="720" w:gutter="0"/>
+      <w:pgMar w:top="300" w:right="0" w:bottom="1440" w:left="0" w:header="720" w:footer="200" w:gutter="0"/>
       <w:cols/>
       <w:docGrid w:linePitch="360"/>
     </w:sectPr>
   </w:body>
 </w:document>
+</file>
+
+<file path=word/footer1.xml><?xml version="1.0" encoding="utf-8"?>
+<w:ftr xmlns:wpc="http://schemas.microsoft.com/office/word/2010/wordprocessingCanvas" xmlns:mo="http://schemas.microsoft.com/office/mac/office/2008/main" xmlns:mc="http://schemas.openxmlformats.org/markup-compatibility/2006" xmlns:mv="urn:schemas-microsoft-com:mac:vml" xmlns:o="urn:schemas-microsoft-com:office:office" xmlns:r="http://schemas.openxmlformats.org/officeDocument/2006/relationships" xmlns:m="http://schemas.openxmlformats.org/officeDocument/2006/math" xmlns:v="urn:schemas-microsoft-com:vml" xmlns:wp14="http://schemas.microsoft.com/office/word/2010/wordprocessingDrawing" xmlns:wp="http://schemas.openxmlformats.org/drawingml/2006/wordprocessingDrawing" xmlns:w10="urn:schemas-microsoft-com:office:word" xmlns:w="http://schemas.openxmlformats.org/wordprocessingml/2006/main" xmlns:w14="http://schemas.microsoft.com/office/word/2010/wordml" xmlns:wpg="http://schemas.microsoft.com/office/word/2010/wordprocessingGroup" xmlns:wpi="http://schemas.microsoft.com/office/word/2010/wordprocessingInk" xmlns:wne="http://schemas.microsoft.com/office/word/2006/wordml" xmlns:wps="http://schemas.microsoft.com/office/word/2010/wordprocessingShape">
+  <w:p>
+    <w:pPr>
+      <w:autoSpaceDN w:val="0"/>
+      <w:autoSpaceDE w:val="0"/>
+      <w:widowControl/>
+      <w:spacing w:line="240" w:lineRule="auto" w:before="0" w:after="120"/>
+      <w:ind w:left="0" w:right="0" w:firstLine="0"/>
+      <w:jc w:val="left"/>
+    </w:pPr>
+    <w:r>
+      <w:drawing>
+        <wp:inline xmlns:a="http://schemas.openxmlformats.org/drawingml/2006/main" xmlns:pic="http://schemas.openxmlformats.org/drawingml/2006/picture">
+          <wp:extent cx="6616700" cy="203200"/>
+          <wp:docPr id="3" name="Picture 3"/>
+          <wp:cNvGraphicFramePr>
+            <a:graphicFrameLocks noChangeAspect="1"/>
+          </wp:cNvGraphicFramePr>
+          <a:graphic>
+            <a:graphicData uri="http://schemas.openxmlformats.org/drawingml/2006/picture">
+              <pic:pic>
+                <pic:nvPicPr>
+                  <pic:cNvPr id="0" name="image.png"/>
+                  <pic:cNvPicPr/>
+                </pic:nvPicPr>
+                <pic:blipFill>
+                  <a:blip r:embed="rId11"/>
+                  <a:stretch>
+                    <a:fillRect/>
+                  </a:stretch>
+                </pic:blipFill>
+                <pic:spPr>
+                  <a:xfrm>
+                    <a:off x="0" y="0"/>
+                    <a:ext cx="6616700" cy="203200"/>
+                  </a:xfrm>
+                  <a:prstGeom prst="rect"/>
+                </pic:spPr>
+              </pic:pic>
+            </a:graphicData>
+          </a:graphic>
+        </wp:inline>
+      </w:drawing>
+    </w:r>
+  </w:p>
+  <w:tbl>
+    <w:tblPr>
+      <w:tblW w:type="auto" w:w="0"/>
+      <w:tblLayout w:type="fixed"/>
+      <w:tblLook w:firstColumn="1" w:firstRow="1" w:lastColumn="0" w:lastRow="0" w:noHBand="0" w:noVBand="1" w:val="04A0"/>
+      <w:tblInd w:w="620.0" w:type="dxa"/>
+    </w:tblPr>
+    <w:tblGrid>
+      <w:gridCol w:w="1504"/>
+      <w:gridCol w:w="1504"/>
+      <w:gridCol w:w="1504"/>
+      <w:gridCol w:w="1504"/>
+      <w:gridCol w:w="1504"/>
+      <w:gridCol w:w="1504"/>
+    </w:tblGrid>
+    <w:tr>
+      <w:trPr>
+        <w:trHeight w:hRule="exact" w:val="292"/>
+      </w:trPr>
+      <w:tc>
+        <w:tcPr>
+          <w:tcW w:type="dxa" w:w="1080"/>
+          <w:vMerge w:val="restart"/>
+          <w:tcBorders/>
+          <w:tcMar>
+            <w:start w:w="0" w:type="dxa"/>
+            <w:end w:w="0" w:type="dxa"/>
+          </w:tcMar>
+          <w:tcMar>
+            <w:start w:w="0" w:type="dxa"/>
+            <w:end w:w="0" w:type="dxa"/>
+          </w:tcMar>
+        </w:tcPr>
+        <w:p>
+          <w:pPr>
+            <w:autoSpaceDN w:val="0"/>
+            <w:autoSpaceDE w:val="0"/>
+            <w:widowControl/>
+            <w:spacing w:line="240" w:lineRule="auto" w:before="110" w:after="0"/>
+            <w:ind w:left="0" w:right="40" w:firstLine="0"/>
+            <w:jc w:val="right"/>
+          </w:pPr>
+          <w:r>
+            <w:drawing>
+              <wp:inline xmlns:a="http://schemas.openxmlformats.org/drawingml/2006/main" xmlns:pic="http://schemas.openxmlformats.org/drawingml/2006/picture">
+                <wp:extent cx="251459" cy="252730"/>
+                <wp:docPr id="4" name="Picture 4"/>
+                <wp:cNvGraphicFramePr>
+                  <a:graphicFrameLocks noChangeAspect="1"/>
+                </wp:cNvGraphicFramePr>
+                <a:graphic>
+                  <a:graphicData uri="http://schemas.openxmlformats.org/drawingml/2006/picture">
+                    <pic:pic>
+                      <pic:nvPicPr>
+                        <pic:cNvPr id="0" name="image.png"/>
+                        <pic:cNvPicPr/>
+                      </pic:nvPicPr>
+                      <pic:blipFill>
+                        <a:blip r:embed="rId12"/>
+                        <a:stretch>
+                          <a:fillRect/>
+                        </a:stretch>
+                      </pic:blipFill>
+                      <pic:spPr>
+                        <a:xfrm>
+                          <a:off x="0" y="0"/>
+                          <a:ext cx="251459" cy="252730"/>
+                        </a:xfrm>
+                        <a:prstGeom prst="rect"/>
+                      </pic:spPr>
+                    </pic:pic>
+                  </a:graphicData>
+                </a:graphic>
+              </wp:inline>
+            </w:drawing>
+          </w:r>
+        </w:p>
+      </w:tc>
+      <w:tc>
+        <w:tcPr>
+          <w:tcW w:type="dxa" w:w="2460"/>
+          <w:vMerge w:val="restart"/>
+          <w:tcBorders/>
+          <w:tcMar>
+            <w:start w:w="0" w:type="dxa"/>
+            <w:end w:w="0" w:type="dxa"/>
+          </w:tcMar>
+          <w:tcMar>
+            <w:start w:w="0" w:type="dxa"/>
+            <w:end w:w="0" w:type="dxa"/>
+          </w:tcMar>
+        </w:tcPr>
+        <w:p>
+          <w:pPr>
+            <w:autoSpaceDN w:val="0"/>
+            <w:autoSpaceDE w:val="0"/>
+            <w:widowControl/>
+            <w:spacing w:line="197" w:lineRule="auto" w:before="248" w:after="0"/>
+            <w:ind w:left="48" w:right="0" w:firstLine="0"/>
+            <w:jc w:val="left"/>
+          </w:pPr>
+          <w:r>
+            <w:rPr>
+              <w:rFonts w:ascii="Calibri" w:hAnsi="Calibri" w:eastAsia="Calibri"/>
+              <w:b w:val="0"/>
+              <w:i w:val="0"/>
+              <w:color w:val="A09F9F"/>
+              <w:sz w:val="16"/>
+            </w:rPr>
+            <w:t>Abu Dhabi, United Arab Emirates</w:t>
+          </w:r>
+        </w:p>
+      </w:tc>
+      <w:tc>
+        <w:tcPr>
+          <w:tcW w:type="dxa" w:w="980"/>
+          <w:vMerge w:val="restart"/>
+          <w:tcBorders/>
+          <w:tcMar>
+            <w:start w:w="0" w:type="dxa"/>
+            <w:end w:w="0" w:type="dxa"/>
+          </w:tcMar>
+          <w:tcMar>
+            <w:start w:w="0" w:type="dxa"/>
+            <w:end w:w="0" w:type="dxa"/>
+          </w:tcMar>
+        </w:tcPr>
+        <w:p>
+          <w:pPr>
+            <w:autoSpaceDN w:val="0"/>
+            <w:autoSpaceDE w:val="0"/>
+            <w:widowControl/>
+            <w:spacing w:line="240" w:lineRule="auto" w:before="78" w:after="0"/>
+            <w:ind w:left="0" w:right="112" w:firstLine="0"/>
+            <w:jc w:val="right"/>
+          </w:pPr>
+          <w:r>
+            <w:drawing>
+              <wp:inline xmlns:a="http://schemas.openxmlformats.org/drawingml/2006/main" xmlns:pic="http://schemas.openxmlformats.org/drawingml/2006/picture">
+                <wp:extent cx="251460" cy="252729"/>
+                <wp:docPr id="5" name="Picture 5"/>
+                <wp:cNvGraphicFramePr>
+                  <a:graphicFrameLocks noChangeAspect="1"/>
+                </wp:cNvGraphicFramePr>
+                <a:graphic>
+                  <a:graphicData uri="http://schemas.openxmlformats.org/drawingml/2006/picture">
+                    <pic:pic>
+                      <pic:nvPicPr>
+                        <pic:cNvPr id="0" name="image.png"/>
+                        <pic:cNvPicPr/>
+                      </pic:nvPicPr>
+                      <pic:blipFill>
+                        <a:blip r:embed="rId13"/>
+                        <a:stretch>
+                          <a:fillRect/>
+                        </a:stretch>
+                      </pic:blipFill>
+                      <pic:spPr>
+                        <a:xfrm>
+                          <a:off x="0" y="0"/>
+                          <a:ext cx="251460" cy="252729"/>
+                        </a:xfrm>
+                        <a:prstGeom prst="rect"/>
+                      </pic:spPr>
+                    </pic:pic>
+                  </a:graphicData>
+                </a:graphic>
+              </wp:inline>
+            </w:drawing>
+          </w:r>
+        </w:p>
+      </w:tc>
+      <w:tc>
+        <w:tcPr>
+          <w:tcW w:type="dxa" w:w="2200"/>
+          <w:tcBorders/>
+          <w:tcMar>
+            <w:start w:w="0" w:type="dxa"/>
+            <w:end w:w="0" w:type="dxa"/>
+          </w:tcMar>
+        </w:tcPr>
+        <w:p>
+          <w:pPr>
+            <w:autoSpaceDN w:val="0"/>
+            <w:autoSpaceDE w:val="0"/>
+            <w:widowControl/>
+            <w:spacing w:line="175" w:lineRule="auto" w:before="48" w:after="0"/>
+            <w:ind w:left="136" w:right="0" w:firstLine="0"/>
+            <w:jc w:val="left"/>
+          </w:pPr>
+          <w:r>
+            <w:rPr>
+              <w:rFonts w:ascii="Myanmar Text" w:hAnsi="Myanmar Text" w:eastAsia="Myanmar Text"/>
+              <w:b w:val="0"/>
+              <w:i w:val="0"/>
+              <w:color w:val="A09F9F"/>
+              <w:sz w:val="18"/>
+            </w:rPr>
+            <w:hyperlink r:id="rId14" w:history="1">
+              <w:r>
+                <w:rPr>
+                  <w:rStyle w:val="Hyperlink"/>
+                </w:rPr>
+                <w:t>info@gss-group.net</w:t>
+              </w:r>
+            </w:hyperlink>
+          </w:r>
+        </w:p>
+      </w:tc>
+      <w:tc>
+        <w:tcPr>
+          <w:tcW w:type="dxa" w:w="1120"/>
+          <w:vMerge w:val="restart"/>
+          <w:tcBorders/>
+          <w:tcMar>
+            <w:start w:w="0" w:type="dxa"/>
+            <w:end w:w="0" w:type="dxa"/>
+          </w:tcMar>
+          <w:tcMar>
+            <w:start w:w="0" w:type="dxa"/>
+            <w:end w:w="0" w:type="dxa"/>
+          </w:tcMar>
+        </w:tcPr>
+        <w:p>
+          <w:pPr>
+            <w:autoSpaceDN w:val="0"/>
+            <w:autoSpaceDE w:val="0"/>
+            <w:widowControl/>
+            <w:spacing w:line="240" w:lineRule="auto" w:before="92" w:after="0"/>
+            <w:ind w:left="0" w:right="76" w:firstLine="0"/>
+            <w:jc w:val="right"/>
+          </w:pPr>
+          <w:r>
+            <w:drawing>
+              <wp:inline xmlns:a="http://schemas.openxmlformats.org/drawingml/2006/main" xmlns:pic="http://schemas.openxmlformats.org/drawingml/2006/picture">
+                <wp:extent cx="251460" cy="252729"/>
+                <wp:docPr id="6" name="Picture 6"/>
+                <wp:cNvGraphicFramePr>
+                  <a:graphicFrameLocks noChangeAspect="1"/>
+                </wp:cNvGraphicFramePr>
+                <a:graphic>
+                  <a:graphicData uri="http://schemas.openxmlformats.org/drawingml/2006/picture">
+                    <pic:pic>
+                      <pic:nvPicPr>
+                        <pic:cNvPr id="0" name="image.png"/>
+                        <pic:cNvPicPr/>
+                      </pic:nvPicPr>
+                      <pic:blipFill>
+                        <a:blip r:embed="rId15"/>
+                        <a:stretch>
+                          <a:fillRect/>
+                        </a:stretch>
+                      </pic:blipFill>
+                      <pic:spPr>
+                        <a:xfrm>
+                          <a:off x="0" y="0"/>
+                          <a:ext cx="251460" cy="252729"/>
+                        </a:xfrm>
+                        <a:prstGeom prst="rect"/>
+                      </pic:spPr>
+                    </pic:pic>
+                  </a:graphicData>
+                </a:graphic>
+              </wp:inline>
+            </w:drawing>
+          </w:r>
+        </w:p>
+      </w:tc>
+      <w:tc>
+        <w:tcPr>
+          <w:tcW w:type="dxa" w:w="2600"/>
+          <w:tcBorders/>
+          <w:tcMar>
+            <w:start w:w="0" w:type="dxa"/>
+            <w:end w:w="0" w:type="dxa"/>
+          </w:tcMar>
+        </w:tcPr>
+        <w:p>
+          <w:pPr>
+            <w:autoSpaceDN w:val="0"/>
+            <w:autoSpaceDE w:val="0"/>
+            <w:widowControl/>
+            <w:spacing w:line="175" w:lineRule="auto" w:before="46" w:after="0"/>
+            <w:ind w:left="112" w:right="0" w:firstLine="0"/>
+            <w:jc w:val="left"/>
+          </w:pPr>
+          <w:r>
+            <w:rPr>
+              <w:rFonts w:ascii="Myanmar Text" w:hAnsi="Myanmar Text" w:eastAsia="Myanmar Text"/>
+              <w:b w:val="0"/>
+              <w:i w:val="0"/>
+              <w:color w:val="A09F9F"/>
+              <w:sz w:val="18"/>
+            </w:rPr>
+            <w:t>Phone: +9712 6666898</w:t>
+          </w:r>
+        </w:p>
+      </w:tc>
+    </w:tr>
+    <w:tr>
+      <w:trPr>
+        <w:trHeight w:hRule="exact" w:val="220"/>
+      </w:trPr>
+      <w:tc>
+        <w:tcPr>
+          <w:tcW w:type="dxa" w:w="1504"/>
+          <w:vMerge/>
+          <w:tcBorders/>
+        </w:tcPr>
+        <w:p/>
+      </w:tc>
+      <w:tc>
+        <w:tcPr>
+          <w:tcW w:type="dxa" w:w="1504"/>
+          <w:vMerge/>
+          <w:tcBorders/>
+        </w:tcPr>
+        <w:p/>
+      </w:tc>
+      <w:tc>
+        <w:tcPr>
+          <w:tcW w:type="dxa" w:w="1504"/>
+          <w:vMerge/>
+          <w:tcBorders/>
+        </w:tcPr>
+        <w:p/>
+      </w:tc>
+      <w:tc>
+        <w:tcPr>
+          <w:tcW w:type="dxa" w:w="2200"/>
+          <w:tcBorders/>
+          <w:tcMar>
+            <w:start w:w="0" w:type="dxa"/>
+            <w:end w:w="0" w:type="dxa"/>
+          </w:tcMar>
+        </w:tcPr>
+        <w:p>
+          <w:pPr>
+            <w:autoSpaceDN w:val="0"/>
+            <w:autoSpaceDE w:val="0"/>
+            <w:widowControl/>
+            <w:spacing w:line="175" w:lineRule="auto" w:before="0" w:after="0"/>
+            <w:ind w:left="152" w:right="0" w:firstLine="0"/>
+            <w:jc w:val="left"/>
+          </w:pPr>
+          <w:r>
+            <w:rPr>
+              <w:rFonts w:ascii="Myanmar Text" w:hAnsi="Myanmar Text" w:eastAsia="Myanmar Text"/>
+              <w:b w:val="0"/>
+              <w:i w:val="0"/>
+              <w:color w:val="A09F9F"/>
+              <w:sz w:val="18"/>
+            </w:rPr>
+            <w:hyperlink r:id="rId14" w:history="1">
+              <w:r>
+                <w:rPr>
+                  <w:rStyle w:val="Hyperlink"/>
+                </w:rPr>
+                <w:t>www.gss-group.net</w:t>
+              </w:r>
+            </w:hyperlink>
+          </w:r>
+        </w:p>
+      </w:tc>
+      <w:tc>
+        <w:tcPr>
+          <w:tcW w:type="dxa" w:w="1504"/>
+          <w:vMerge/>
+          <w:tcBorders/>
+        </w:tcPr>
+        <w:p/>
+      </w:tc>
+      <w:tc>
+        <w:tcPr>
+          <w:tcW w:type="dxa" w:w="2600"/>
+          <w:tcBorders/>
+          <w:tcMar>
+            <w:start w:w="0" w:type="dxa"/>
+            <w:end w:w="0" w:type="dxa"/>
+          </w:tcMar>
+        </w:tcPr>
+        <w:p>
+          <w:pPr>
+            <w:autoSpaceDN w:val="0"/>
+            <w:autoSpaceDE w:val="0"/>
+            <w:widowControl/>
+            <w:spacing w:line="240" w:lineRule="auto" w:before="0" w:after="0"/>
+            <w:ind w:left="112" w:right="0" w:firstLine="0"/>
+            <w:jc w:val="left"/>
+          </w:pPr>
+          <w:r>
+            <w:rPr>
+              <w:rFonts w:ascii="Gill Sans MT" w:hAnsi="Gill Sans MT" w:eastAsia="Gill Sans MT"/>
+              <w:b w:val="0"/>
+              <w:i w:val="0"/>
+              <w:color w:val="A09F9F"/>
+              <w:sz w:val="19"/>
+            </w:rPr>
+            <w:t>Fax: +971 2 666 8980</w:t>
+          </w:r>
+        </w:p>
+      </w:tc>
+    </w:tr>
+  </w:tbl>
+  <w:p>
+    <w:pPr>
+      <w:spacing w:before="0" w:after="0" w:line="14" w:lineRule="exact"/>
+    </w:pPr>
+  </w:p>
+</w:ftr>
 </file>
 
 <file path=word/numbering.xml><?xml version="1.0" encoding="utf-8"?>

</xml_diff>